<commit_message>
Add city detail tables and shareable links
</commit_message>
<xml_diff>
--- a/paper.docx
+++ b/paper.docx
@@ -442,7 +442,7 @@
         <w:t xml:space="preserve"> </w:t>
       </w:r>
       <w:r>
-        <w:t xml:space="preserve">August 5, 2026 at 13:22 UTC. Before rendering, the workflow checks the current</w:t>
+        <w:t xml:space="preserve">August 15, 2026 at 21:26 UTC. Before rendering, the workflow checks the current</w:t>
       </w:r>
       <w:r>
         <w:t xml:space="preserve"> </w:t>
@@ -3646,28 +3646,236 @@
       </w:tr>
     </w:tbl>
     <w:bookmarkEnd w:id="33"/>
-    <w:bookmarkStart w:id="51" w:name="a-city-example-philadelphia"/>
+    <w:bookmarkStart w:id="38" w:name="shared-time-period-variation"/>
     <w:p>
       <w:pPr>
         <w:pStyle w:val="Heading1"/>
       </w:pPr>
       <w:r>
-        <w:t xml:space="preserve">A city example: Philadelphia</w:t>
-      </w:r>
-    </w:p>
-    <w:bookmarkStart w:id="41" w:name="robbery"/>
-    <w:p>
-      <w:pPr>
-        <w:pStyle w:val="Heading2"/>
-      </w:pPr>
-      <w:r>
-        <w:t xml:space="preserve">Robbery</w:t>
+        <w:t xml:space="preserve">Shared time period variation</w:t>
       </w:r>
     </w:p>
     <w:p>
       <w:pPr>
         <w:pStyle w:val="FirstParagraph"/>
       </w:pPr>
+      <w:hyperlink w:anchor="fig-global-residual">
+        <w:r>
+          <w:rPr>
+            <w:rStyle w:val="Hyperlink"/>
+          </w:rPr>
+          <w:t xml:space="preserve">Figure 3</w:t>
+        </w:r>
+      </w:hyperlink>
+      <w:r>
+        <w:t xml:space="preserve"> </w:t>
+      </w:r>
+      <w:r>
+        <w:t xml:space="preserve">shows the fitted common time-period effect</w:t>
+      </w:r>
+      <w:r>
+        <w:t xml:space="preserve"> </w:t>
+      </w:r>
+      <m:oMath>
+        <m:sSub>
+          <m:e>
+            <m:r>
+              <m:t>a</m:t>
+            </m:r>
+          </m:e>
+          <m:sub>
+            <m:r>
+              <m:t>t</m:t>
+            </m:r>
+          </m:sub>
+        </m:sSub>
+      </m:oMath>
+      <w:r>
+        <w:t xml:space="preserve">. I</w:t>
+      </w:r>
+      <w:r>
+        <w:t xml:space="preserve"> </w:t>
+      </w:r>
+      <w:r>
+        <w:t xml:space="preserve">transform it from the logit scale to a change in the annualized global rate.</w:t>
+      </w:r>
+      <w:r>
+        <w:t xml:space="preserve"> </w:t>
+      </w:r>
+      <w:r>
+        <w:t xml:space="preserve">This isolates monthly movement shared across the sample after accounting for</w:t>
+      </w:r>
+      <w:r>
+        <w:t xml:space="preserve"> </w:t>
+      </w:r>
+      <w:r>
+        <w:t xml:space="preserve">trend and season; it does not include the city-specific effect</w:t>
+      </w:r>
+      <w:r>
+        <w:t xml:space="preserve"> </w:t>
+      </w:r>
+      <m:oMath>
+        <m:sSub>
+          <m:e>
+            <m:r>
+              <m:t>e</m:t>
+            </m:r>
+          </m:e>
+          <m:sub>
+            <m:r>
+              <m:t>i</m:t>
+            </m:r>
+            <m:r>
+              <m:t>t</m:t>
+            </m:r>
+          </m:sub>
+        </m:sSub>
+      </m:oMath>
+      <w:r>
+        <w:t xml:space="preserve">. A</w:t>
+      </w:r>
+      <w:r>
+        <w:t xml:space="preserve"> </w:t>
+      </w:r>
+      <w:r>
+        <w:t xml:space="preserve">positive monthly effect can therefore occur during a declining trend whenever</w:t>
+      </w:r>
+      <w:r>
+        <w:t xml:space="preserve"> </w:t>
+      </w:r>
+      <w:r>
+        <w:t xml:space="preserve">that month is above its still-declining baseline.</w:t>
+      </w:r>
+    </w:p>
+    <w:tbl>
+      <w:tblPr>
+        <w:tblStyle w:val="Table"/>
+        <w:tblW w:type="pct" w:w="5000"/>
+        <w:tblLook w:firstRow="0" w:lastRow="0" w:firstColumn="0" w:lastColumn="0" w:noHBand="0" w:noVBand="0" w:val="0000"/>
+        <w:jc w:val="start"/>
+        <w:tblLayout w:type="fixed"/>
+      </w:tblPr>
+      <w:tblGrid>
+        <w:gridCol w:w="7920"/>
+      </w:tblGrid>
+      <w:tr>
+        <w:tc>
+          <w:tcPr/>
+          <w:bookmarkStart w:id="37" w:name="fig-global-residual"/>
+          <w:p>
+            <w:pPr>
+              <w:pStyle w:val="Compact"/>
+              <w:jc w:val="center"/>
+            </w:pPr>
+            <w:r>
+              <w:drawing>
+                <wp:inline>
+                  <wp:extent cx="5334000" cy="5179218"/>
+                  <wp:effectExtent b="0" l="0" r="0" t="0"/>
+                  <wp:docPr descr="" title="" id="35" name="Picture"/>
+                  <a:graphic>
+                    <a:graphicData uri="http://schemas.openxmlformats.org/drawingml/2006/picture">
+                      <pic:pic>
+                        <pic:nvPicPr>
+                          <pic:cNvPr descr="output/markdown/images/fig-global-residual-1.png" id="36" name="Picture"/>
+                          <pic:cNvPicPr>
+                            <a:picLocks noChangeArrowheads="1" noChangeAspect="1"/>
+                          </pic:cNvPicPr>
+                        </pic:nvPicPr>
+                        <pic:blipFill>
+                          <a:blip r:embed="rId34"/>
+                          <a:stretch>
+                            <a:fillRect/>
+                          </a:stretch>
+                        </pic:blipFill>
+                        <pic:spPr bwMode="auto">
+                          <a:xfrm>
+                            <a:off x="0" y="0"/>
+                            <a:ext cx="5334000" cy="5179218"/>
+                          </a:xfrm>
+                          <a:prstGeom prst="rect">
+                            <a:avLst/>
+                          </a:prstGeom>
+                          <a:noFill/>
+                          <a:ln w="9525">
+                            <a:noFill/>
+                            <a:headEnd/>
+                            <a:tailEnd/>
+                          </a:ln>
+                        </pic:spPr>
+                      </pic:pic>
+                    </a:graphicData>
+                  </a:graphic>
+                </wp:inline>
+              </w:drawing>
+            </w:r>
+          </w:p>
+          <w:p>
+            <w:pPr>
+              <w:jc w:val="center"/>
+            </w:pPr>
+            <w:pPr>
+              <w:jc w:val="start"/>
+              <w:spacing w:before="200"/>
+              <w:pStyle w:val="ImageCaption"/>
+            </w:pPr>
+            <w:r>
+              <w:t xml:space="preserve">Figure 3: Fitted shared time-period random effect for each offense, transformed to its change in the annualized global rate. Positive values are time-period departures above the global trend-plus-seasonal curve; negative values are departures below it. Panels use offense-specific vertical scales.</w:t>
+            </w:r>
+          </w:p>
+          <w:bookmarkEnd w:id="37"/>
+        </w:tc>
+      </w:tr>
+    </w:tbl>
+    <w:p>
+      <w:pPr>
+        <w:pStyle w:val="BodyText"/>
+      </w:pPr>
+      <w:r>
+        <w:t xml:space="preserve">The common time-period term separates abrupt movement from gradual change.</w:t>
+      </w:r>
+      <w:r>
+        <w:t xml:space="preserve"> </w:t>
+      </w:r>
+      <w:r>
+        <w:t xml:space="preserve">April 2020 is a prominent negative departure for rape, assault, and theft;</w:t>
+      </w:r>
+      <w:r>
+        <w:t xml:space="preserve"> </w:t>
+      </w:r>
+      <w:r>
+        <w:t xml:space="preserve">motor vehicle theft has a large positive shared departure in October 2023.</w:t>
+      </w:r>
+      <w:r>
+        <w:t xml:space="preserve"> </w:t>
+      </w:r>
+      <w:r>
+        <w:t xml:space="preserve">Their timing does not identify a cause.</w:t>
+      </w:r>
+    </w:p>
+    <w:bookmarkEnd w:id="38"/>
+    <w:bookmarkStart w:id="56" w:name="a-city-example-philadelphia"/>
+    <w:p>
+      <w:pPr>
+        <w:pStyle w:val="Heading1"/>
+      </w:pPr>
+      <w:r>
+        <w:t xml:space="preserve">A city example: Philadelphia</w:t>
+      </w:r>
+    </w:p>
+    <w:bookmarkStart w:id="46" w:name="robbery"/>
+    <w:p>
+      <w:pPr>
+        <w:pStyle w:val="Heading2"/>
+      </w:pPr>
+      <w:r>
+        <w:t xml:space="preserve">Robbery</w:t>
+      </w:r>
+    </w:p>
+    <w:p>
+      <w:pPr>
+        <w:pStyle w:val="FirstParagraph"/>
+      </w:pPr>
       <w:r>
         <w:t xml:space="preserve">Philadelphia robbery illustrates what each layer adds. The global curve is the</w:t>
       </w:r>
@@ -3705,18 +3913,18 @@
           <wp:inline>
             <wp:extent cx="5334000" cy="3655218"/>
             <wp:effectExtent b="0" l="0" r="0" t="0"/>
-            <wp:docPr descr="Observed robbery rate and fitted global and Philadelphia curves." title="" id="35" name="Picture"/>
+            <wp:docPr descr="Observed robbery rate and fitted global and Philadelphia curves." title="" id="40" name="Picture"/>
             <a:graphic>
               <a:graphicData uri="http://schemas.openxmlformats.org/drawingml/2006/picture">
                 <pic:pic>
                   <pic:nvPicPr>
-                    <pic:cNvPr descr="output/markdown/images/unnamed-chunk-2-1.png" id="36" name="Picture"/>
+                    <pic:cNvPr descr="output/markdown/images/unnamed-chunk-2-1.png" id="41" name="Picture"/>
                     <pic:cNvPicPr>
                       <a:picLocks noChangeArrowheads="1" noChangeAspect="1"/>
                     </pic:cNvPicPr>
                   </pic:nvPicPr>
                   <pic:blipFill>
-                    <a:blip r:embed="rId34"/>
+                    <a:blip r:embed="rId39"/>
                     <a:stretch>
                       <a:fillRect/>
                     </a:stretch>
@@ -3826,7 +4034,7 @@
           <w:rPr>
             <w:rStyle w:val="Hyperlink"/>
           </w:rPr>
-          <w:t xml:space="preserve">Figure 3</w:t>
+          <w:t xml:space="preserve">Figure 4</w:t>
         </w:r>
       </w:hyperlink>
       <w:r>
@@ -3927,7 +4135,7 @@
       <w:tr>
         <w:tc>
           <w:tcPr/>
-          <w:bookmarkStart w:id="40" w:name="fig-city-components"/>
+          <w:bookmarkStart w:id="45" w:name="fig-city-components"/>
           <w:p>
             <w:pPr>
               <w:pStyle w:val="Compact"/>
@@ -3938,18 +4146,18 @@
                 <wp:inline>
                   <wp:extent cx="5334000" cy="4953000"/>
                   <wp:effectExtent b="0" l="0" r="0" t="0"/>
-                  <wp:docPr descr="" title="" id="38" name="Picture"/>
+                  <wp:docPr descr="" title="" id="43" name="Picture"/>
                   <a:graphic>
                     <a:graphicData uri="http://schemas.openxmlformats.org/drawingml/2006/picture">
                       <pic:pic>
                         <pic:nvPicPr>
-                          <pic:cNvPr descr="output/markdown/images/fig-city-components-1.png" id="39" name="Picture"/>
+                          <pic:cNvPr descr="output/markdown/images/fig-city-components-1.png" id="44" name="Picture"/>
                           <pic:cNvPicPr>
                             <a:picLocks noChangeArrowheads="1" noChangeAspect="1"/>
                           </pic:cNvPicPr>
                         </pic:nvPicPr>
                         <pic:blipFill>
-                          <a:blip r:embed="rId37"/>
+                          <a:blip r:embed="rId42"/>
                           <a:stretch>
                             <a:fillRect/>
                           </a:stretch>
@@ -3986,15 +4194,15 @@
               <w:pStyle w:val="ImageCaption"/>
             </w:pPr>
             <w:r>
-              <w:t xml:space="preserve">Figure 3: Philadelphia and full-sample robbery components on the logit scale: centered long-run trends with the city intercept removed (top), Fourier seasonal curves (middle), and the sample-wide time-period residual compared with Philadelphia’s time-period plus city-month residual (bottom). Shading gives approximate 95% pointwise conditional intervals for Philadelphia’s trend and seasonal deviations.</w:t>
+              <w:t xml:space="preserve">Figure 4: Philadelphia and full-sample robbery components on the logit scale: centered long-run trends with the city intercept removed (top), Fourier seasonal curves (middle), and the sample-wide time-period residual compared with Philadelphia’s time-period plus city-month residual (bottom). Shading gives approximate 95% pointwise conditional intervals for Philadelphia’s trend and seasonal deviations.</w:t>
             </w:r>
           </w:p>
-          <w:bookmarkEnd w:id="40"/>
+          <w:bookmarkEnd w:id="45"/>
         </w:tc>
       </w:tr>
     </w:tbl>
-    <w:bookmarkEnd w:id="41"/>
-    <w:bookmarkStart w:id="50" w:name="burglary"/>
+    <w:bookmarkEnd w:id="46"/>
+    <w:bookmarkStart w:id="55" w:name="burglary"/>
     <w:p>
       <w:pPr>
         <w:pStyle w:val="Heading2"/>
@@ -4026,7 +4234,7 @@
         <w:t xml:space="preserve"> </w:t>
       </w:r>
       <w:r>
-        <w:t xml:space="preserve">August 5, 2026 at 13:22 UTC, Philadelphia reported</w:t>
+        <w:t xml:space="preserve">August 15, 2026 at 21:26 UTC, Philadelphia reported</w:t>
       </w:r>
       <w:r>
         <w:t xml:space="preserve"> </w:t>
@@ -4092,7 +4300,7 @@
           <w:rPr>
             <w:rStyle w:val="Hyperlink"/>
           </w:rPr>
-          <w:t xml:space="preserve">Figure 4</w:t>
+          <w:t xml:space="preserve">Figure 5</w:t>
         </w:r>
       </w:hyperlink>
       <w:r>
@@ -4140,7 +4348,7 @@
       <w:tr>
         <w:tc>
           <w:tcPr/>
-          <w:bookmarkStart w:id="45" w:name="fig-philly-burglary-rate"/>
+          <w:bookmarkStart w:id="50" w:name="fig-philly-burglary-rate"/>
           <w:p>
             <w:pPr>
               <w:pStyle w:val="Compact"/>
@@ -4151,18 +4359,18 @@
                 <wp:inline>
                   <wp:extent cx="5334000" cy="3655218"/>
                   <wp:effectExtent b="0" l="0" r="0" t="0"/>
-                  <wp:docPr descr="" title="" id="43" name="Picture"/>
+                  <wp:docPr descr="" title="" id="48" name="Picture"/>
                   <a:graphic>
                     <a:graphicData uri="http://schemas.openxmlformats.org/drawingml/2006/picture">
                       <pic:pic>
                         <pic:nvPicPr>
-                          <pic:cNvPr descr="output/markdown/images/fig-philly-burglary-rate-1.png" id="44" name="Picture"/>
+                          <pic:cNvPr descr="output/markdown/images/fig-philly-burglary-rate-1.png" id="49" name="Picture"/>
                           <pic:cNvPicPr>
                             <a:picLocks noChangeArrowheads="1" noChangeAspect="1"/>
                           </pic:cNvPicPr>
                         </pic:nvPicPr>
                         <pic:blipFill>
-                          <a:blip r:embed="rId42"/>
+                          <a:blip r:embed="rId47"/>
                           <a:stretch>
                             <a:fillRect/>
                           </a:stretch>
@@ -4199,10 +4407,10 @@
               <w:pStyle w:val="ImageCaption"/>
             </w:pPr>
             <w:r>
-              <w:t xml:space="preserve">Figure 4: Philadelphia burglary rates: reported monthly observations, the global structural curve, and Philadelphia’s fitted city curve. The pronounced May, June, and October 2020 observations come directly from the RTCI source counts; the smooth curves exclude shared time-period and city-month residual effects.</w:t>
+              <w:t xml:space="preserve">Figure 5: Philadelphia burglary rates: reported monthly observations, the global structural curve, and Philadelphia’s fitted city curve. The pronounced May, June, and October 2020 observations come directly from the RTCI source counts; the smooth curves exclude shared time-period and city-month residual effects.</w:t>
             </w:r>
           </w:p>
-          <w:bookmarkEnd w:id="45"/>
+          <w:bookmarkEnd w:id="50"/>
         </w:tc>
       </w:tr>
     </w:tbl>
@@ -4220,7 +4428,7 @@
           <w:rPr>
             <w:rStyle w:val="Hyperlink"/>
           </w:rPr>
-          <w:t xml:space="preserve">Figure 5</w:t>
+          <w:t xml:space="preserve">Figure 6</w:t>
         </w:r>
       </w:hyperlink>
       <w:r>
@@ -4268,7 +4476,7 @@
       <w:tr>
         <w:tc>
           <w:tcPr/>
-          <w:bookmarkStart w:id="49" w:name="fig-philly-burglary-components"/>
+          <w:bookmarkStart w:id="54" w:name="fig-philly-burglary-components"/>
           <w:p>
             <w:pPr>
               <w:pStyle w:val="Compact"/>
@@ -4279,18 +4487,18 @@
                 <wp:inline>
                   <wp:extent cx="5334000" cy="4953000"/>
                   <wp:effectExtent b="0" l="0" r="0" t="0"/>
-                  <wp:docPr descr="" title="" id="47" name="Picture"/>
+                  <wp:docPr descr="" title="" id="52" name="Picture"/>
                   <a:graphic>
                     <a:graphicData uri="http://schemas.openxmlformats.org/drawingml/2006/picture">
                       <pic:pic>
                         <pic:nvPicPr>
-                          <pic:cNvPr descr="output/markdown/images/fig-philly-burglary-components-1.png" id="48" name="Picture"/>
+                          <pic:cNvPr descr="output/markdown/images/fig-philly-burglary-components-1.png" id="53" name="Picture"/>
                           <pic:cNvPicPr>
                             <a:picLocks noChangeArrowheads="1" noChangeAspect="1"/>
                           </pic:cNvPicPr>
                         </pic:nvPicPr>
                         <pic:blipFill>
-                          <a:blip r:embed="rId46"/>
+                          <a:blip r:embed="rId51"/>
                           <a:stretch>
                             <a:fillRect/>
                           </a:stretch>
@@ -4327,222 +4535,14 @@
               <w:pStyle w:val="ImageCaption"/>
             </w:pPr>
             <w:r>
-              <w:t xml:space="preserve">Figure 5: Philadelphia and full-sample burglary components on the logit scale: centered long-run trends (top), Fourier seasonal curves (middle), and the sample-wide time-period residual compared with Philadelphia’s time-period plus city-month residual (bottom). Approximate 95% pointwise conditional intervals are shown for Philadelphia’s trend and seasonal deviations.</w:t>
+              <w:t xml:space="preserve">Figure 6: Philadelphia and full-sample burglary components on the logit scale: centered long-run trends (top), Fourier seasonal curves (middle), and the sample-wide time-period residual compared with Philadelphia’s time-period plus city-month residual (bottom). Approximate 95% pointwise conditional intervals are shown for Philadelphia’s trend and seasonal deviations.</w:t>
             </w:r>
           </w:p>
-          <w:bookmarkEnd w:id="49"/>
+          <w:bookmarkEnd w:id="54"/>
         </w:tc>
       </w:tr>
     </w:tbl>
-    <w:bookmarkEnd w:id="50"/>
-    <w:bookmarkEnd w:id="51"/>
-    <w:bookmarkStart w:id="56" w:name="shared-time-period-variation"/>
-    <w:p>
-      <w:pPr>
-        <w:pStyle w:val="Heading1"/>
-      </w:pPr>
-      <w:r>
-        <w:t xml:space="preserve">Shared time period variation</w:t>
-      </w:r>
-    </w:p>
-    <w:p>
-      <w:pPr>
-        <w:pStyle w:val="FirstParagraph"/>
-      </w:pPr>
-      <w:hyperlink w:anchor="fig-global-residual">
-        <w:r>
-          <w:rPr>
-            <w:rStyle w:val="Hyperlink"/>
-          </w:rPr>
-          <w:t xml:space="preserve">Figure 6</w:t>
-        </w:r>
-      </w:hyperlink>
-      <w:r>
-        <w:t xml:space="preserve"> </w:t>
-      </w:r>
-      <w:r>
-        <w:t xml:space="preserve">shows the fitted common time-period effect</w:t>
-      </w:r>
-      <w:r>
-        <w:t xml:space="preserve"> </w:t>
-      </w:r>
-      <m:oMath>
-        <m:sSub>
-          <m:e>
-            <m:r>
-              <m:t>a</m:t>
-            </m:r>
-          </m:e>
-          <m:sub>
-            <m:r>
-              <m:t>t</m:t>
-            </m:r>
-          </m:sub>
-        </m:sSub>
-      </m:oMath>
-      <w:r>
-        <w:t xml:space="preserve">. I</w:t>
-      </w:r>
-      <w:r>
-        <w:t xml:space="preserve"> </w:t>
-      </w:r>
-      <w:r>
-        <w:t xml:space="preserve">transform it from the logit scale to a change in the annualized global rate.</w:t>
-      </w:r>
-      <w:r>
-        <w:t xml:space="preserve"> </w:t>
-      </w:r>
-      <w:r>
-        <w:t xml:space="preserve">This isolates monthly movement shared across the sample after accounting for</w:t>
-      </w:r>
-      <w:r>
-        <w:t xml:space="preserve"> </w:t>
-      </w:r>
-      <w:r>
-        <w:t xml:space="preserve">trend and season; it does not include the city-specific effect</w:t>
-      </w:r>
-      <w:r>
-        <w:t xml:space="preserve"> </w:t>
-      </w:r>
-      <m:oMath>
-        <m:sSub>
-          <m:e>
-            <m:r>
-              <m:t>e</m:t>
-            </m:r>
-          </m:e>
-          <m:sub>
-            <m:r>
-              <m:t>i</m:t>
-            </m:r>
-            <m:r>
-              <m:t>t</m:t>
-            </m:r>
-          </m:sub>
-        </m:sSub>
-      </m:oMath>
-      <w:r>
-        <w:t xml:space="preserve">. A</w:t>
-      </w:r>
-      <w:r>
-        <w:t xml:space="preserve"> </w:t>
-      </w:r>
-      <w:r>
-        <w:t xml:space="preserve">positive monthly effect can therefore occur during a declining trend whenever</w:t>
-      </w:r>
-      <w:r>
-        <w:t xml:space="preserve"> </w:t>
-      </w:r>
-      <w:r>
-        <w:t xml:space="preserve">that month is above its still-declining baseline.</w:t>
-      </w:r>
-    </w:p>
-    <w:tbl>
-      <w:tblPr>
-        <w:tblStyle w:val="Table"/>
-        <w:tblW w:type="pct" w:w="5000"/>
-        <w:tblLook w:firstRow="0" w:lastRow="0" w:firstColumn="0" w:lastColumn="0" w:noHBand="0" w:noVBand="0" w:val="0000"/>
-        <w:jc w:val="start"/>
-        <w:tblLayout w:type="fixed"/>
-      </w:tblPr>
-      <w:tblGrid>
-        <w:gridCol w:w="7920"/>
-      </w:tblGrid>
-      <w:tr>
-        <w:tc>
-          <w:tcPr/>
-          <w:bookmarkStart w:id="55" w:name="fig-global-residual"/>
-          <w:p>
-            <w:pPr>
-              <w:pStyle w:val="Compact"/>
-              <w:jc w:val="center"/>
-            </w:pPr>
-            <w:r>
-              <w:drawing>
-                <wp:inline>
-                  <wp:extent cx="5334000" cy="5179218"/>
-                  <wp:effectExtent b="0" l="0" r="0" t="0"/>
-                  <wp:docPr descr="" title="" id="53" name="Picture"/>
-                  <a:graphic>
-                    <a:graphicData uri="http://schemas.openxmlformats.org/drawingml/2006/picture">
-                      <pic:pic>
-                        <pic:nvPicPr>
-                          <pic:cNvPr descr="output/markdown/images/fig-global-residual-1.png" id="54" name="Picture"/>
-                          <pic:cNvPicPr>
-                            <a:picLocks noChangeArrowheads="1" noChangeAspect="1"/>
-                          </pic:cNvPicPr>
-                        </pic:nvPicPr>
-                        <pic:blipFill>
-                          <a:blip r:embed="rId52"/>
-                          <a:stretch>
-                            <a:fillRect/>
-                          </a:stretch>
-                        </pic:blipFill>
-                        <pic:spPr bwMode="auto">
-                          <a:xfrm>
-                            <a:off x="0" y="0"/>
-                            <a:ext cx="5334000" cy="5179218"/>
-                          </a:xfrm>
-                          <a:prstGeom prst="rect">
-                            <a:avLst/>
-                          </a:prstGeom>
-                          <a:noFill/>
-                          <a:ln w="9525">
-                            <a:noFill/>
-                            <a:headEnd/>
-                            <a:tailEnd/>
-                          </a:ln>
-                        </pic:spPr>
-                      </pic:pic>
-                    </a:graphicData>
-                  </a:graphic>
-                </wp:inline>
-              </w:drawing>
-            </w:r>
-          </w:p>
-          <w:p>
-            <w:pPr>
-              <w:jc w:val="center"/>
-            </w:pPr>
-            <w:pPr>
-              <w:jc w:val="start"/>
-              <w:spacing w:before="200"/>
-              <w:pStyle w:val="ImageCaption"/>
-            </w:pPr>
-            <w:r>
-              <w:t xml:space="preserve">Figure 6: Fitted shared time-period random effect for each offense, transformed to its change in the annualized global rate. Positive values are time-period departures above the global trend-plus-seasonal curve; negative values are departures below it. Panels use offense-specific vertical scales.</w:t>
-            </w:r>
-          </w:p>
-          <w:bookmarkEnd w:id="55"/>
-        </w:tc>
-      </w:tr>
-    </w:tbl>
-    <w:p>
-      <w:pPr>
-        <w:pStyle w:val="BodyText"/>
-      </w:pPr>
-      <w:r>
-        <w:t xml:space="preserve">The common time-period term separates abrupt movement from gradual change.</w:t>
-      </w:r>
-      <w:r>
-        <w:t xml:space="preserve"> </w:t>
-      </w:r>
-      <w:r>
-        <w:t xml:space="preserve">April 2020 is a prominent negative departure for rape, assault, and theft;</w:t>
-      </w:r>
-      <w:r>
-        <w:t xml:space="preserve"> </w:t>
-      </w:r>
-      <w:r>
-        <w:t xml:space="preserve">motor vehicle theft has a large positive shared departure in October 2023.</w:t>
-      </w:r>
-      <w:r>
-        <w:t xml:space="preserve"> </w:t>
-      </w:r>
-      <w:r>
-        <w:t xml:space="preserve">Their timing does not identify a cause.</w:t>
-      </w:r>
-    </w:p>
+    <w:bookmarkEnd w:id="55"/>
     <w:bookmarkEnd w:id="56"/>
     <w:bookmarkStart w:id="65" w:name="cities-with-unusually-different-trends"/>
     <w:p>

</xml_diff>